<commit_message>
Add comprehensive solution for typographic quote normalization in JSON input
- Implemented `normalizeJsonText` function to replace typographic quotes and dashes.
- Integrated normalization in the document generation process.
- Added clipboard functionality for normalized JSON on parse error.
- Updated UI to reflect error messages and success states.
- Removed outdated instructions template and updated document template.
</commit_message>
<xml_diff>
--- a/templates/acta_ac_template.docx
+++ b/templates/acta_ac_template.docx
@@ -663,6 +663,147 @@
     </w:p>
     <w:p>
       <w:pPr>
+        <w:rPr>
+          <w:rFonts w:ascii="Arial" w:cs="Arial" w:eastAsia="Arial" w:hAnsi="Arial"/>
+          <w:sz w:val="16"/>
+          <w:szCs w:val="16"/>
+        </w:rPr>
+      </w:pPr>
+      <w:r>
+        <w:rPr>
+          <w:rFonts w:ascii="Arial" w:cs="Arial" w:eastAsia="Arial" w:hAnsi="Arial"/>
+          <w:sz w:val="16"/>
+          <w:szCs w:val="16"/>
+          <w:rtl w:val="0"/>
+        </w:rPr>
+        <w:t xml:space="preserve">[[#orden_del_dia]]</w:t>
+      </w:r>
+    </w:p>
+    <w:p>
+      <w:pPr>
+        <w:rPr>
+          <w:rFonts w:ascii="Arial" w:cs="Arial" w:eastAsia="Arial" w:hAnsi="Arial"/>
+          <w:sz w:val="16"/>
+          <w:szCs w:val="16"/>
+        </w:rPr>
+      </w:pPr>
+      <w:r>
+        <w:rPr>
+          <w:rFonts w:ascii="Arial" w:cs="Arial" w:eastAsia="Arial" w:hAnsi="Arial"/>
+          <w:sz w:val="16"/>
+          <w:szCs w:val="16"/>
+          <w:rtl w:val="0"/>
+        </w:rPr>
+        <w:t xml:space="preserve">[[.]]</w:t>
+      </w:r>
+    </w:p>
+    <w:p>
+      <w:pPr>
+        <w:rPr>
+          <w:rFonts w:ascii="Arial" w:cs="Arial" w:eastAsia="Arial" w:hAnsi="Arial"/>
+          <w:sz w:val="16"/>
+          <w:szCs w:val="16"/>
+        </w:rPr>
+      </w:pPr>
+      <w:r>
+        <w:rPr>
+          <w:rFonts w:ascii="Arial" w:cs="Arial" w:eastAsia="Arial" w:hAnsi="Arial"/>
+          <w:sz w:val="16"/>
+          <w:szCs w:val="16"/>
+          <w:rtl w:val="0"/>
+        </w:rPr>
+        <w:t xml:space="preserve">[[/orden_del_dia]]</w:t>
+      </w:r>
+    </w:p>
+    <w:p>
+      <w:pPr>
+        <w:rPr>
+          <w:rFonts w:ascii="Arial" w:cs="Arial" w:eastAsia="Arial" w:hAnsi="Arial"/>
+          <w:sz w:val="16"/>
+          <w:szCs w:val="16"/>
+        </w:rPr>
+      </w:pPr>
+      <w:r>
+        <w:rPr>
+          <w:rtl w:val="0"/>
+        </w:rPr>
+      </w:r>
+    </w:p>
+    <w:p>
+      <w:pPr>
+        <w:rPr>
+          <w:rFonts w:ascii="Arial" w:cs="Arial" w:eastAsia="Arial" w:hAnsi="Arial"/>
+          <w:sz w:val="16"/>
+          <w:szCs w:val="16"/>
+          <w:vertAlign w:val="baseline"/>
+        </w:rPr>
+      </w:pPr>
+      <w:r>
+        <w:rPr>
+          <w:rtl w:val="0"/>
+        </w:rPr>
+      </w:r>
+    </w:p>
+    <w:p>
+      <w:pPr>
+        <w:rPr>
+          <w:rFonts w:ascii="Arial" w:cs="Arial" w:eastAsia="Arial" w:hAnsi="Arial"/>
+          <w:b w:val="0"/>
+          <w:bCs w:val="0"/>
+          <w:sz w:val="16"/>
+          <w:szCs w:val="16"/>
+          <w:vertAlign w:val="baseline"/>
+        </w:rPr>
+      </w:pPr>
+      <w:r>
+        <w:rPr>
+          <w:rFonts w:ascii="Arial" w:cs="Arial" w:eastAsia="Arial" w:hAnsi="Arial"/>
+          <w:b w:val="1"/>
+          <w:bCs w:val="1"/>
+          <w:sz w:val="16"/>
+          <w:szCs w:val="16"/>
+          <w:vertAlign w:val="baseline"/>
+          <w:rtl w:val="0"/>
+        </w:rPr>
+        <w:t xml:space="preserve">Desarrollo de la Reunión:</w:t>
+      </w:r>
+      <w:r>
+        <w:rPr>
+          <w:rtl w:val="0"/>
+        </w:rPr>
+      </w:r>
+    </w:p>
+    <w:p>
+      <w:pPr>
+        <w:rPr>
+          <w:rFonts w:ascii="Arial" w:cs="Arial" w:eastAsia="Arial" w:hAnsi="Arial"/>
+          <w:sz w:val="16"/>
+          <w:szCs w:val="16"/>
+          <w:vertAlign w:val="baseline"/>
+        </w:rPr>
+      </w:pPr>
+      <w:r>
+        <w:rPr>
+          <w:rtl w:val="0"/>
+        </w:rPr>
+      </w:r>
+    </w:p>
+    <w:p>
+      <w:pPr>
+        <w:rPr>
+          <w:rFonts w:ascii="Arial" w:cs="Arial" w:eastAsia="Arial" w:hAnsi="Arial"/>
+          <w:sz w:val="16"/>
+          <w:szCs w:val="16"/>
+        </w:rPr>
+      </w:pPr>
+      <w:r>
+        <w:rPr>
+          <w:rtl w:val="0"/>
+        </w:rPr>
+      </w:r>
+    </w:p>
+    <w:p>
+      <w:pPr>
         <w:numPr>
           <w:ilvl w:val="0"/>
           <w:numId w:val="1"/>
@@ -683,7 +824,71 @@
           <w:vertAlign w:val="baseline"/>
           <w:rtl w:val="0"/>
         </w:rPr>
-        <w:t xml:space="preserve">Lectura del acta anterior</w:t>
+        <w:t xml:space="preserve">Temas tratados</w:t>
+      </w:r>
+    </w:p>
+    <w:p>
+      <w:pPr>
+        <w:ind w:left="720" w:firstLine="0"/>
+        <w:rPr>
+          <w:rFonts w:ascii="Arial" w:cs="Arial" w:eastAsia="Arial" w:hAnsi="Arial"/>
+          <w:sz w:val="16"/>
+          <w:szCs w:val="16"/>
+        </w:rPr>
+      </w:pPr>
+      <w:r>
+        <w:rPr>
+          <w:rFonts w:ascii="Arial" w:cs="Arial" w:eastAsia="Arial" w:hAnsi="Arial"/>
+          <w:sz w:val="16"/>
+          <w:szCs w:val="16"/>
+          <w:rtl w:val="0"/>
+        </w:rPr>
+        <w:t xml:space="preserve">[[temas_tratados_texto]]</w:t>
+      </w:r>
+    </w:p>
+    <w:p>
+      <w:pPr>
+        <w:ind w:left="720" w:firstLine="0"/>
+        <w:rPr>
+          <w:rFonts w:ascii="Arial" w:cs="Arial" w:eastAsia="Arial" w:hAnsi="Arial"/>
+          <w:sz w:val="16"/>
+          <w:szCs w:val="16"/>
+        </w:rPr>
+      </w:pPr>
+      <w:r>
+        <w:rPr>
+          <w:rtl w:val="0"/>
+        </w:rPr>
+      </w:r>
+    </w:p>
+    <w:p>
+      <w:pPr>
+        <w:ind w:left="720" w:firstLine="0"/>
+        <w:rPr>
+          <w:rFonts w:ascii="Arial" w:cs="Arial" w:eastAsia="Arial" w:hAnsi="Arial"/>
+          <w:sz w:val="16"/>
+          <w:szCs w:val="16"/>
+        </w:rPr>
+      </w:pPr>
+      <w:r>
+        <w:rPr>
+          <w:rtl w:val="0"/>
+        </w:rPr>
+      </w:r>
+    </w:p>
+    <w:p>
+      <w:pPr>
+        <w:rPr>
+          <w:rFonts w:ascii="Arial" w:cs="Arial" w:eastAsia="Arial" w:hAnsi="Arial"/>
+          <w:sz w:val="16"/>
+          <w:szCs w:val="16"/>
+          <w:vertAlign w:val="baseline"/>
+        </w:rPr>
+      </w:pPr>
+      <w:r>
+        <w:rPr>
+          <w:rtl w:val="0"/>
+        </w:rPr>
       </w:r>
     </w:p>
     <w:p>
@@ -708,7 +913,41 @@
           <w:vertAlign w:val="baseline"/>
           <w:rtl w:val="0"/>
         </w:rPr>
-        <w:t xml:space="preserve">Revisión compromisos anteriores</w:t>
+        <w:t xml:space="preserve">Proposiciones y varios</w:t>
+      </w:r>
+    </w:p>
+    <w:p>
+      <w:pPr>
+        <w:ind w:left="720" w:firstLine="0"/>
+        <w:rPr>
+          <w:rFonts w:ascii="Arial" w:cs="Arial" w:eastAsia="Arial" w:hAnsi="Arial"/>
+          <w:sz w:val="16"/>
+          <w:szCs w:val="16"/>
+        </w:rPr>
+      </w:pPr>
+      <w:r>
+        <w:rPr>
+          <w:rFonts w:ascii="Arial" w:cs="Arial" w:eastAsia="Arial" w:hAnsi="Arial"/>
+          <w:sz w:val="16"/>
+          <w:szCs w:val="16"/>
+          <w:rtl w:val="0"/>
+        </w:rPr>
+        <w:t xml:space="preserve">[[proposiciones_y_varios]]</w:t>
+      </w:r>
+    </w:p>
+    <w:p>
+      <w:pPr>
+        <w:rPr>
+          <w:rFonts w:ascii="Arial" w:cs="Arial" w:eastAsia="Arial" w:hAnsi="Arial"/>
+          <w:sz w:val="16"/>
+          <w:szCs w:val="16"/>
+          <w:vertAlign w:val="baseline"/>
+        </w:rPr>
+      </w:pPr>
+      <w:r>
+        <w:rPr>
+          <w:rtl w:val="0"/>
+        </w:rPr>
       </w:r>
     </w:p>
     <w:p>
@@ -733,228 +972,7 @@
           <w:vertAlign w:val="baseline"/>
           <w:rtl w:val="0"/>
         </w:rPr>
-        <w:t xml:space="preserve">Temas tratados </w:t>
-      </w:r>
-    </w:p>
-    <w:p>
-      <w:pPr>
-        <w:numPr>
-          <w:ilvl w:val="0"/>
-          <w:numId w:val="1"/>
-        </w:numPr>
-        <w:ind w:left="360" w:hanging="360"/>
-        <w:rPr>
-          <w:rFonts w:ascii="Arial" w:cs="Arial" w:eastAsia="Arial" w:hAnsi="Arial"/>
-          <w:sz w:val="16"/>
-          <w:szCs w:val="16"/>
-          <w:vertAlign w:val="baseline"/>
-        </w:rPr>
-      </w:pPr>
-      <w:r>
-        <w:rPr>
-          <w:rFonts w:ascii="Arial" w:cs="Arial" w:eastAsia="Arial" w:hAnsi="Arial"/>
-          <w:sz w:val="16"/>
-          <w:szCs w:val="16"/>
-          <w:vertAlign w:val="baseline"/>
-          <w:rtl w:val="0"/>
-        </w:rPr>
-        <w:t xml:space="preserve">Proposiciones y varios</w:t>
-      </w:r>
-    </w:p>
-    <w:p>
-      <w:pPr>
-        <w:numPr>
-          <w:ilvl w:val="0"/>
-          <w:numId w:val="1"/>
-        </w:numPr>
-        <w:ind w:left="360" w:hanging="360"/>
-        <w:rPr>
-          <w:rFonts w:ascii="Arial" w:cs="Arial" w:eastAsia="Arial" w:hAnsi="Arial"/>
-          <w:sz w:val="16"/>
-          <w:szCs w:val="16"/>
-          <w:vertAlign w:val="baseline"/>
-        </w:rPr>
-      </w:pPr>
-      <w:r>
-        <w:rPr>
-          <w:rFonts w:ascii="Arial" w:cs="Arial" w:eastAsia="Arial" w:hAnsi="Arial"/>
-          <w:sz w:val="16"/>
-          <w:szCs w:val="16"/>
-          <w:vertAlign w:val="baseline"/>
-          <w:rtl w:val="0"/>
-        </w:rPr>
         <w:t xml:space="preserve">Compromisos pactados</w:t>
-      </w:r>
-    </w:p>
-    <w:p>
-      <w:pPr>
-        <w:rPr>
-          <w:rFonts w:ascii="Arial" w:cs="Arial" w:eastAsia="Arial" w:hAnsi="Arial"/>
-          <w:sz w:val="16"/>
-          <w:szCs w:val="16"/>
-          <w:vertAlign w:val="baseline"/>
-        </w:rPr>
-      </w:pPr>
-      <w:r>
-        <w:rPr>
-          <w:rtl w:val="0"/>
-        </w:rPr>
-      </w:r>
-    </w:p>
-    <w:p>
-      <w:pPr>
-        <w:rPr>
-          <w:rFonts w:ascii="Arial" w:cs="Arial" w:eastAsia="Arial" w:hAnsi="Arial"/>
-          <w:sz w:val="16"/>
-          <w:szCs w:val="16"/>
-          <w:vertAlign w:val="baseline"/>
-        </w:rPr>
-      </w:pPr>
-      <w:r>
-        <w:rPr>
-          <w:rtl w:val="0"/>
-        </w:rPr>
-      </w:r>
-    </w:p>
-    <w:p>
-      <w:pPr>
-        <w:rPr>
-          <w:rFonts w:ascii="Arial" w:cs="Arial" w:eastAsia="Arial" w:hAnsi="Arial"/>
-          <w:b w:val="0"/>
-          <w:bCs w:val="0"/>
-          <w:sz w:val="16"/>
-          <w:szCs w:val="16"/>
-          <w:vertAlign w:val="baseline"/>
-        </w:rPr>
-      </w:pPr>
-      <w:r>
-        <w:rPr>
-          <w:rFonts w:ascii="Arial" w:cs="Arial" w:eastAsia="Arial" w:hAnsi="Arial"/>
-          <w:b w:val="1"/>
-          <w:bCs w:val="1"/>
-          <w:sz w:val="16"/>
-          <w:szCs w:val="16"/>
-          <w:vertAlign w:val="baseline"/>
-          <w:rtl w:val="0"/>
-        </w:rPr>
-        <w:t xml:space="preserve">Desarrollo de la Reunión:</w:t>
-      </w:r>
-      <w:r>
-        <w:rPr>
-          <w:rtl w:val="0"/>
-        </w:rPr>
-      </w:r>
-    </w:p>
-    <w:p>
-      <w:pPr>
-        <w:rPr>
-          <w:rFonts w:ascii="Arial" w:cs="Arial" w:eastAsia="Arial" w:hAnsi="Arial"/>
-          <w:sz w:val="16"/>
-          <w:szCs w:val="16"/>
-          <w:vertAlign w:val="baseline"/>
-        </w:rPr>
-      </w:pPr>
-      <w:r>
-        <w:rPr>
-          <w:rtl w:val="0"/>
-        </w:rPr>
-      </w:r>
-    </w:p>
-    <w:p>
-      <w:pPr>
-        <w:numPr>
-          <w:ilvl w:val="0"/>
-          <w:numId w:val="2"/>
-        </w:numPr>
-        <w:ind w:left="360" w:hanging="360"/>
-        <w:rPr>
-          <w:rFonts w:ascii="Arial" w:cs="Arial" w:eastAsia="Arial" w:hAnsi="Arial"/>
-          <w:sz w:val="16"/>
-          <w:szCs w:val="16"/>
-          <w:vertAlign w:val="baseline"/>
-        </w:rPr>
-      </w:pPr>
-      <w:r>
-        <w:rPr>
-          <w:rFonts w:ascii="Arial" w:cs="Arial" w:eastAsia="Arial" w:hAnsi="Arial"/>
-          <w:sz w:val="16"/>
-          <w:szCs w:val="16"/>
-          <w:vertAlign w:val="baseline"/>
-          <w:rtl w:val="0"/>
-        </w:rPr>
-        <w:t xml:space="preserve">Lectura del acta anterior</w:t>
-      </w:r>
-    </w:p>
-    <w:p>
-      <w:pPr>
-        <w:ind w:firstLine="720"/>
-        <w:rPr>
-          <w:rFonts w:ascii="Arial" w:cs="Arial" w:eastAsia="Arial" w:hAnsi="Arial"/>
-          <w:sz w:val="16"/>
-          <w:szCs w:val="16"/>
-        </w:rPr>
-      </w:pPr>
-      <w:r>
-        <w:rPr>
-          <w:rFonts w:ascii="Arial" w:cs="Arial" w:eastAsia="Arial" w:hAnsi="Arial"/>
-          <w:sz w:val="16"/>
-          <w:szCs w:val="16"/>
-          <w:rtl w:val="0"/>
-        </w:rPr>
-        <w:t xml:space="preserve">[[lectura_acta_anterior]]</w:t>
-      </w:r>
-    </w:p>
-    <w:p>
-      <w:pPr>
-        <w:rPr>
-          <w:rFonts w:ascii="Arial" w:cs="Arial" w:eastAsia="Arial" w:hAnsi="Arial"/>
-          <w:sz w:val="16"/>
-          <w:szCs w:val="16"/>
-        </w:rPr>
-      </w:pPr>
-      <w:r>
-        <w:rPr>
-          <w:rtl w:val="0"/>
-        </w:rPr>
-      </w:r>
-    </w:p>
-    <w:p>
-      <w:pPr>
-        <w:rPr>
-          <w:rFonts w:ascii="Arial" w:cs="Arial" w:eastAsia="Arial" w:hAnsi="Arial"/>
-          <w:sz w:val="16"/>
-          <w:szCs w:val="16"/>
-        </w:rPr>
-      </w:pPr>
-      <w:r>
-        <w:rPr>
-          <w:rtl w:val="0"/>
-        </w:rPr>
-      </w:r>
-    </w:p>
-    <w:p>
-      <w:pPr>
-        <w:numPr>
-          <w:ilvl w:val="0"/>
-          <w:numId w:val="2"/>
-        </w:numPr>
-        <w:ind w:left="360" w:hanging="360"/>
-        <w:rPr>
-          <w:rFonts w:ascii="Arial" w:cs="Arial" w:eastAsia="Arial" w:hAnsi="Arial"/>
-          <w:sz w:val="16"/>
-          <w:szCs w:val="16"/>
-          <w:vertAlign w:val="baseline"/>
-        </w:rPr>
-      </w:pPr>
-      <w:r>
-        <w:rPr>
-          <w:rFonts w:ascii="Arial" w:cs="Arial" w:eastAsia="Arial" w:hAnsi="Arial"/>
-          <w:sz w:val="16"/>
-          <w:szCs w:val="16"/>
-          <w:vertAlign w:val="baseline"/>
-          <w:rtl w:val="0"/>
-        </w:rPr>
-        <w:t xml:space="preserve">Revisión de compromisos anteriores</w:t>
       </w:r>
     </w:p>
     <w:p>
@@ -975,571 +993,6 @@
     <w:tbl>
       <w:tblPr>
         <w:tblStyle w:val="Table2"/>
-        <w:tblW w:w="9540.0" w:type="dxa"/>
-        <w:jc w:val="left"/>
-        <w:tblBorders>
-          <w:top w:color="000000" w:space="0" w:sz="4" w:val="single"/>
-          <w:left w:color="000000" w:space="0" w:sz="4" w:val="single"/>
-          <w:bottom w:color="000000" w:space="0" w:sz="4" w:val="single"/>
-          <w:right w:color="000000" w:space="0" w:sz="4" w:val="single"/>
-          <w:insideH w:color="000000" w:space="0" w:sz="4" w:val="single"/>
-          <w:insideV w:color="000000" w:space="0" w:sz="4" w:val="single"/>
-        </w:tblBorders>
-        <w:tblLayout w:type="fixed"/>
-        <w:tblLook w:val="0000"/>
-      </w:tblPr>
-      <w:tblGrid>
-        <w:gridCol w:w="870"/>
-        <w:gridCol w:w="2190"/>
-        <w:gridCol w:w="1980"/>
-        <w:gridCol w:w="1260"/>
-        <w:gridCol w:w="3240"/>
-        <w:tblGridChange w:id="0">
-          <w:tblGrid>
-            <w:gridCol w:w="870"/>
-            <w:gridCol w:w="2190"/>
-            <w:gridCol w:w="1980"/>
-            <w:gridCol w:w="1260"/>
-            <w:gridCol w:w="3240"/>
-          </w:tblGrid>
-        </w:tblGridChange>
-      </w:tblGrid>
-      <w:tr>
-        <w:trPr>
-          <w:cantSplit w:val="0"/>
-          <w:tblHeader w:val="0"/>
-        </w:trPr>
-        <w:tc>
-          <w:tcPr>
-            <w:vAlign w:val="center"/>
-          </w:tcPr>
-          <w:p>
-            <w:pPr>
-              <w:jc w:val="center"/>
-              <w:rPr>
-                <w:rFonts w:ascii="Arial" w:cs="Arial" w:eastAsia="Arial" w:hAnsi="Arial"/>
-                <w:b w:val="0"/>
-                <w:bCs w:val="0"/>
-                <w:sz w:val="16"/>
-                <w:szCs w:val="16"/>
-                <w:vertAlign w:val="baseline"/>
-              </w:rPr>
-            </w:pPr>
-            <w:r>
-              <w:rPr>
-                <w:rFonts w:ascii="Arial" w:cs="Arial" w:eastAsia="Arial" w:hAnsi="Arial"/>
-                <w:b w:val="1"/>
-                <w:bCs w:val="1"/>
-                <w:sz w:val="16"/>
-                <w:szCs w:val="16"/>
-                <w:vertAlign w:val="baseline"/>
-                <w:rtl w:val="0"/>
-              </w:rPr>
-              <w:t xml:space="preserve">No.</w:t>
-            </w:r>
-            <w:r>
-              <w:rPr>
-                <w:rtl w:val="0"/>
-              </w:rPr>
-            </w:r>
-          </w:p>
-        </w:tc>
-        <w:tc>
-          <w:tcPr>
-            <w:vAlign w:val="center"/>
-          </w:tcPr>
-          <w:p>
-            <w:pPr>
-              <w:jc w:val="center"/>
-              <w:rPr>
-                <w:rFonts w:ascii="Arial" w:cs="Arial" w:eastAsia="Arial" w:hAnsi="Arial"/>
-                <w:b w:val="0"/>
-                <w:bCs w:val="0"/>
-                <w:sz w:val="16"/>
-                <w:szCs w:val="16"/>
-                <w:vertAlign w:val="baseline"/>
-              </w:rPr>
-            </w:pPr>
-            <w:r>
-              <w:rPr>
-                <w:rFonts w:ascii="Arial" w:cs="Arial" w:eastAsia="Arial" w:hAnsi="Arial"/>
-                <w:b w:val="1"/>
-                <w:bCs w:val="1"/>
-                <w:sz w:val="16"/>
-                <w:szCs w:val="16"/>
-                <w:vertAlign w:val="baseline"/>
-                <w:rtl w:val="0"/>
-              </w:rPr>
-              <w:t xml:space="preserve">Compromisos Anteriores</w:t>
-            </w:r>
-            <w:r>
-              <w:rPr>
-                <w:rtl w:val="0"/>
-              </w:rPr>
-            </w:r>
-          </w:p>
-        </w:tc>
-        <w:tc>
-          <w:tcPr>
-            <w:vAlign w:val="center"/>
-          </w:tcPr>
-          <w:p>
-            <w:pPr>
-              <w:jc w:val="center"/>
-              <w:rPr>
-                <w:rFonts w:ascii="Arial" w:cs="Arial" w:eastAsia="Arial" w:hAnsi="Arial"/>
-                <w:b w:val="0"/>
-                <w:bCs w:val="0"/>
-                <w:sz w:val="16"/>
-                <w:szCs w:val="16"/>
-                <w:vertAlign w:val="baseline"/>
-              </w:rPr>
-            </w:pPr>
-            <w:r>
-              <w:rPr>
-                <w:rFonts w:ascii="Arial" w:cs="Arial" w:eastAsia="Arial" w:hAnsi="Arial"/>
-                <w:b w:val="1"/>
-                <w:bCs w:val="1"/>
-                <w:sz w:val="16"/>
-                <w:szCs w:val="16"/>
-                <w:vertAlign w:val="baseline"/>
-                <w:rtl w:val="0"/>
-              </w:rPr>
-              <w:t xml:space="preserve">Responsable</w:t>
-            </w:r>
-            <w:r>
-              <w:rPr>
-                <w:rtl w:val="0"/>
-              </w:rPr>
-            </w:r>
-          </w:p>
-        </w:tc>
-        <w:tc>
-          <w:tcPr>
-            <w:vAlign w:val="center"/>
-          </w:tcPr>
-          <w:p>
-            <w:pPr>
-              <w:jc w:val="center"/>
-              <w:rPr>
-                <w:rFonts w:ascii="Arial" w:cs="Arial" w:eastAsia="Arial" w:hAnsi="Arial"/>
-                <w:b w:val="0"/>
-                <w:bCs w:val="0"/>
-                <w:sz w:val="16"/>
-                <w:szCs w:val="16"/>
-                <w:vertAlign w:val="baseline"/>
-              </w:rPr>
-            </w:pPr>
-            <w:r>
-              <w:rPr>
-                <w:rFonts w:ascii="Arial" w:cs="Arial" w:eastAsia="Arial" w:hAnsi="Arial"/>
-                <w:b w:val="1"/>
-                <w:bCs w:val="1"/>
-                <w:sz w:val="16"/>
-                <w:szCs w:val="16"/>
-                <w:vertAlign w:val="baseline"/>
-                <w:rtl w:val="0"/>
-              </w:rPr>
-              <w:t xml:space="preserve">Fecha de Logro</w:t>
-            </w:r>
-            <w:r>
-              <w:rPr>
-                <w:rtl w:val="0"/>
-              </w:rPr>
-            </w:r>
-          </w:p>
-        </w:tc>
-        <w:tc>
-          <w:tcPr>
-            <w:vAlign w:val="center"/>
-          </w:tcPr>
-          <w:p>
-            <w:pPr>
-              <w:jc w:val="center"/>
-              <w:rPr>
-                <w:rFonts w:ascii="Arial" w:cs="Arial" w:eastAsia="Arial" w:hAnsi="Arial"/>
-                <w:b w:val="0"/>
-                <w:bCs w:val="0"/>
-                <w:sz w:val="16"/>
-                <w:szCs w:val="16"/>
-                <w:vertAlign w:val="baseline"/>
-              </w:rPr>
-            </w:pPr>
-            <w:r>
-              <w:rPr>
-                <w:rFonts w:ascii="Arial" w:cs="Arial" w:eastAsia="Arial" w:hAnsi="Arial"/>
-                <w:b w:val="1"/>
-                <w:bCs w:val="1"/>
-                <w:sz w:val="16"/>
-                <w:szCs w:val="16"/>
-                <w:vertAlign w:val="baseline"/>
-                <w:rtl w:val="0"/>
-              </w:rPr>
-              <w:t xml:space="preserve">Estado del Compromiso</w:t>
-            </w:r>
-            <w:r>
-              <w:rPr>
-                <w:rtl w:val="0"/>
-              </w:rPr>
-            </w:r>
-          </w:p>
-        </w:tc>
-      </w:tr>
-      <w:tr>
-        <w:trPr>
-          <w:cantSplit w:val="0"/>
-          <w:tblHeader w:val="0"/>
-        </w:trPr>
-        <w:tc>
-          <w:tcPr>
-            <w:vAlign w:val="center"/>
-          </w:tcPr>
-          <w:p>
-            <w:pPr>
-              <w:jc w:val="center"/>
-              <w:rPr>
-                <w:rFonts w:ascii="Arial" w:cs="Arial" w:eastAsia="Arial" w:hAnsi="Arial"/>
-                <w:sz w:val="16"/>
-                <w:szCs w:val="16"/>
-              </w:rPr>
-            </w:pPr>
-            <w:r>
-              <w:rPr>
-                <w:rFonts w:ascii="Arial" w:cs="Arial" w:eastAsia="Arial" w:hAnsi="Arial"/>
-                <w:sz w:val="16"/>
-                <w:szCs w:val="16"/>
-                <w:rtl w:val="0"/>
-              </w:rPr>
-              <w:t xml:space="preserve">[[#compromisos_anteriores]][[no]]</w:t>
-            </w:r>
-          </w:p>
-        </w:tc>
-        <w:tc>
-          <w:tcPr>
-            <w:vAlign w:val="top"/>
-          </w:tcPr>
-          <w:p>
-            <w:pPr>
-              <w:rPr>
-                <w:rFonts w:ascii="Arial" w:cs="Arial" w:eastAsia="Arial" w:hAnsi="Arial"/>
-                <w:sz w:val="16"/>
-                <w:szCs w:val="16"/>
-                <w:vertAlign w:val="baseline"/>
-              </w:rPr>
-            </w:pPr>
-            <w:r>
-              <w:rPr>
-                <w:rFonts w:ascii="Arial" w:cs="Arial" w:eastAsia="Arial" w:hAnsi="Arial"/>
-                <w:sz w:val="16"/>
-                <w:szCs w:val="16"/>
-                <w:rtl w:val="0"/>
-              </w:rPr>
-              <w:t xml:space="preserve">[[compromiso]]</w:t>
-            </w:r>
-            <w:r>
-              <w:rPr>
-                <w:rtl w:val="0"/>
-              </w:rPr>
-            </w:r>
-          </w:p>
-        </w:tc>
-        <w:tc>
-          <w:tcPr>
-            <w:vAlign w:val="center"/>
-          </w:tcPr>
-          <w:p>
-            <w:pPr>
-              <w:jc w:val="center"/>
-              <w:rPr>
-                <w:rFonts w:ascii="Arial" w:cs="Arial" w:eastAsia="Arial" w:hAnsi="Arial"/>
-                <w:sz w:val="16"/>
-                <w:szCs w:val="16"/>
-                <w:vertAlign w:val="baseline"/>
-              </w:rPr>
-            </w:pPr>
-            <w:r>
-              <w:rPr>
-                <w:rFonts w:ascii="Arial" w:cs="Arial" w:eastAsia="Arial" w:hAnsi="Arial"/>
-                <w:sz w:val="16"/>
-                <w:szCs w:val="16"/>
-                <w:rtl w:val="0"/>
-              </w:rPr>
-              <w:t xml:space="preserve">[[responsable]]</w:t>
-            </w:r>
-            <w:r>
-              <w:rPr>
-                <w:rtl w:val="0"/>
-              </w:rPr>
-            </w:r>
-          </w:p>
-        </w:tc>
-        <w:tc>
-          <w:tcPr>
-            <w:vAlign w:val="center"/>
-          </w:tcPr>
-          <w:p>
-            <w:pPr>
-              <w:jc w:val="center"/>
-              <w:rPr>
-                <w:rFonts w:ascii="Arial" w:cs="Arial" w:eastAsia="Arial" w:hAnsi="Arial"/>
-                <w:sz w:val="16"/>
-                <w:szCs w:val="16"/>
-                <w:vertAlign w:val="baseline"/>
-              </w:rPr>
-            </w:pPr>
-            <w:r>
-              <w:rPr>
-                <w:rFonts w:ascii="Arial" w:cs="Arial" w:eastAsia="Arial" w:hAnsi="Arial"/>
-                <w:sz w:val="16"/>
-                <w:szCs w:val="16"/>
-                <w:rtl w:val="0"/>
-              </w:rPr>
-              <w:t xml:space="preserve">[[fecha_logro]]</w:t>
-            </w:r>
-            <w:r>
-              <w:rPr>
-                <w:rtl w:val="0"/>
-              </w:rPr>
-            </w:r>
-          </w:p>
-        </w:tc>
-        <w:tc>
-          <w:tcPr>
-            <w:vAlign w:val="center"/>
-          </w:tcPr>
-          <w:p>
-            <w:pPr>
-              <w:rPr>
-                <w:rFonts w:ascii="Arial" w:cs="Arial" w:eastAsia="Arial" w:hAnsi="Arial"/>
-                <w:sz w:val="16"/>
-                <w:szCs w:val="16"/>
-                <w:vertAlign w:val="baseline"/>
-              </w:rPr>
-            </w:pPr>
-            <w:r>
-              <w:rPr>
-                <w:rFonts w:ascii="Arial" w:cs="Arial" w:eastAsia="Arial" w:hAnsi="Arial"/>
-                <w:sz w:val="16"/>
-                <w:szCs w:val="16"/>
-                <w:rtl w:val="0"/>
-              </w:rPr>
-              <w:t xml:space="preserve">[[estado]][[/compromisos_anteriores]]</w:t>
-            </w:r>
-            <w:r>
-              <w:rPr>
-                <w:rtl w:val="0"/>
-              </w:rPr>
-            </w:r>
-          </w:p>
-        </w:tc>
-      </w:tr>
-    </w:tbl>
-    <w:p>
-      <w:pPr>
-        <w:rPr>
-          <w:rFonts w:ascii="Arial" w:cs="Arial" w:eastAsia="Arial" w:hAnsi="Arial"/>
-          <w:sz w:val="16"/>
-          <w:szCs w:val="16"/>
-          <w:vertAlign w:val="baseline"/>
-        </w:rPr>
-      </w:pPr>
-      <w:r>
-        <w:rPr>
-          <w:rtl w:val="0"/>
-        </w:rPr>
-      </w:r>
-    </w:p>
-    <w:p>
-      <w:pPr>
-        <w:numPr>
-          <w:ilvl w:val="0"/>
-          <w:numId w:val="2"/>
-        </w:numPr>
-        <w:ind w:left="360" w:hanging="360"/>
-        <w:rPr>
-          <w:rFonts w:ascii="Arial" w:cs="Arial" w:eastAsia="Arial" w:hAnsi="Arial"/>
-          <w:sz w:val="16"/>
-          <w:szCs w:val="16"/>
-          <w:vertAlign w:val="baseline"/>
-        </w:rPr>
-      </w:pPr>
-      <w:r>
-        <w:rPr>
-          <w:rFonts w:ascii="Arial" w:cs="Arial" w:eastAsia="Arial" w:hAnsi="Arial"/>
-          <w:sz w:val="16"/>
-          <w:szCs w:val="16"/>
-          <w:vertAlign w:val="baseline"/>
-          <w:rtl w:val="0"/>
-        </w:rPr>
-        <w:t xml:space="preserve">Temas tratados</w:t>
-      </w:r>
-    </w:p>
-    <w:p>
-      <w:pPr>
-        <w:ind w:left="720" w:firstLine="0"/>
-        <w:rPr>
-          <w:rFonts w:ascii="Arial" w:cs="Arial" w:eastAsia="Arial" w:hAnsi="Arial"/>
-          <w:sz w:val="16"/>
-          <w:szCs w:val="16"/>
-        </w:rPr>
-      </w:pPr>
-      <w:r>
-        <w:rPr>
-          <w:rFonts w:ascii="Arial" w:cs="Arial" w:eastAsia="Arial" w:hAnsi="Arial"/>
-          <w:sz w:val="16"/>
-          <w:szCs w:val="16"/>
-          <w:rtl w:val="0"/>
-        </w:rPr>
-        <w:t xml:space="preserve">[[temas_tratados_texto]]</w:t>
-      </w:r>
-    </w:p>
-    <w:p>
-      <w:pPr>
-        <w:ind w:left="720" w:firstLine="0"/>
-        <w:rPr>
-          <w:rFonts w:ascii="Arial" w:cs="Arial" w:eastAsia="Arial" w:hAnsi="Arial"/>
-          <w:sz w:val="16"/>
-          <w:szCs w:val="16"/>
-        </w:rPr>
-      </w:pPr>
-      <w:r>
-        <w:rPr>
-          <w:rtl w:val="0"/>
-        </w:rPr>
-      </w:r>
-    </w:p>
-    <w:p>
-      <w:pPr>
-        <w:ind w:left="720" w:firstLine="0"/>
-        <w:rPr>
-          <w:rFonts w:ascii="Arial" w:cs="Arial" w:eastAsia="Arial" w:hAnsi="Arial"/>
-          <w:sz w:val="16"/>
-          <w:szCs w:val="16"/>
-        </w:rPr>
-      </w:pPr>
-      <w:r>
-        <w:rPr>
-          <w:rtl w:val="0"/>
-        </w:rPr>
-      </w:r>
-    </w:p>
-    <w:p>
-      <w:pPr>
-        <w:rPr>
-          <w:rFonts w:ascii="Arial" w:cs="Arial" w:eastAsia="Arial" w:hAnsi="Arial"/>
-          <w:sz w:val="16"/>
-          <w:szCs w:val="16"/>
-          <w:vertAlign w:val="baseline"/>
-        </w:rPr>
-      </w:pPr>
-      <w:r>
-        <w:rPr>
-          <w:rtl w:val="0"/>
-        </w:rPr>
-      </w:r>
-    </w:p>
-    <w:p>
-      <w:pPr>
-        <w:numPr>
-          <w:ilvl w:val="0"/>
-          <w:numId w:val="2"/>
-        </w:numPr>
-        <w:ind w:left="360" w:hanging="360"/>
-        <w:rPr>
-          <w:rFonts w:ascii="Arial" w:cs="Arial" w:eastAsia="Arial" w:hAnsi="Arial"/>
-          <w:sz w:val="16"/>
-          <w:szCs w:val="16"/>
-          <w:vertAlign w:val="baseline"/>
-        </w:rPr>
-      </w:pPr>
-      <w:r>
-        <w:rPr>
-          <w:rFonts w:ascii="Arial" w:cs="Arial" w:eastAsia="Arial" w:hAnsi="Arial"/>
-          <w:sz w:val="16"/>
-          <w:szCs w:val="16"/>
-          <w:vertAlign w:val="baseline"/>
-          <w:rtl w:val="0"/>
-        </w:rPr>
-        <w:t xml:space="preserve">Proposiciones y varios</w:t>
-      </w:r>
-    </w:p>
-    <w:p>
-      <w:pPr>
-        <w:ind w:left="720" w:firstLine="0"/>
-        <w:rPr>
-          <w:rFonts w:ascii="Arial" w:cs="Arial" w:eastAsia="Arial" w:hAnsi="Arial"/>
-          <w:sz w:val="16"/>
-          <w:szCs w:val="16"/>
-        </w:rPr>
-      </w:pPr>
-      <w:r>
-        <w:rPr>
-          <w:rFonts w:ascii="Arial" w:cs="Arial" w:eastAsia="Arial" w:hAnsi="Arial"/>
-          <w:sz w:val="16"/>
-          <w:szCs w:val="16"/>
-          <w:rtl w:val="0"/>
-        </w:rPr>
-        <w:t xml:space="preserve">[[proposiciones_y_varios]]</w:t>
-      </w:r>
-    </w:p>
-    <w:p>
-      <w:pPr>
-        <w:rPr>
-          <w:rFonts w:ascii="Arial" w:cs="Arial" w:eastAsia="Arial" w:hAnsi="Arial"/>
-          <w:sz w:val="16"/>
-          <w:szCs w:val="16"/>
-          <w:vertAlign w:val="baseline"/>
-        </w:rPr>
-      </w:pPr>
-      <w:r>
-        <w:rPr>
-          <w:rtl w:val="0"/>
-        </w:rPr>
-      </w:r>
-    </w:p>
-    <w:p>
-      <w:pPr>
-        <w:numPr>
-          <w:ilvl w:val="0"/>
-          <w:numId w:val="2"/>
-        </w:numPr>
-        <w:ind w:left="360" w:hanging="360"/>
-        <w:rPr>
-          <w:rFonts w:ascii="Arial" w:cs="Arial" w:eastAsia="Arial" w:hAnsi="Arial"/>
-          <w:sz w:val="16"/>
-          <w:szCs w:val="16"/>
-          <w:vertAlign w:val="baseline"/>
-        </w:rPr>
-      </w:pPr>
-      <w:r>
-        <w:rPr>
-          <w:rFonts w:ascii="Arial" w:cs="Arial" w:eastAsia="Arial" w:hAnsi="Arial"/>
-          <w:sz w:val="16"/>
-          <w:szCs w:val="16"/>
-          <w:vertAlign w:val="baseline"/>
-          <w:rtl w:val="0"/>
-        </w:rPr>
-        <w:t xml:space="preserve">Compromisos pactados</w:t>
-      </w:r>
-    </w:p>
-    <w:p>
-      <w:pPr>
-        <w:rPr>
-          <w:rFonts w:ascii="Arial" w:cs="Arial" w:eastAsia="Arial" w:hAnsi="Arial"/>
-          <w:sz w:val="16"/>
-          <w:szCs w:val="16"/>
-          <w:vertAlign w:val="baseline"/>
-        </w:rPr>
-      </w:pPr>
-      <w:r>
-        <w:rPr>
-          <w:rtl w:val="0"/>
-        </w:rPr>
-      </w:r>
-    </w:p>
-    <w:tbl>
-      <w:tblPr>
-        <w:tblStyle w:val="Table3"/>
         <w:tblW w:w="9540.0" w:type="dxa"/>
         <w:jc w:val="left"/>
         <w:tblBorders>
@@ -2047,7 +1500,7 @@
           <w:szCs w:val="16"/>
           <w:rtl w:val="0"/>
         </w:rPr>
-        <w:t xml:space="preserve">___________________</w:t>
+        <w:t xml:space="preserve">_____ [[nombre_elabora]] __</w:t>
       </w:r>
       <w:r>
         <w:rPr>
@@ -2072,7 +1525,7 @@
           <w:szCs w:val="16"/>
           <w:rtl w:val="0"/>
         </w:rPr>
-        <w:t xml:space="preserve">___________________</w:t>
+        <w:t xml:space="preserve">_____ [[nombre_revisa]] __</w:t>
       </w:r>
       <w:r>
         <w:rPr>
@@ -2165,7 +1618,7 @@
   </w:p>
   <w:tbl>
     <w:tblPr>
-      <w:tblStyle w:val="Table4"/>
+      <w:tblStyle w:val="Table3"/>
       <w:tblW w:w="9790.0" w:type="dxa"/>
       <w:jc w:val="left"/>
       <w:tblInd w:w="-70.0" w:type="dxa"/>
@@ -2884,7 +2337,7 @@
       <w:lvlText w:val="%1."/>
       <w:lvlJc w:val="left"/>
       <w:pPr>
-        <w:ind w:left="360" w:hanging="360"/>
+        <w:ind w:left="720" w:hanging="360"/>
       </w:pPr>
       <w:rPr>
         <w:b w:val="0"/>
@@ -2898,7 +2351,7 @@
       <w:lvlText w:val="%2."/>
       <w:lvlJc w:val="left"/>
       <w:pPr>
-        <w:ind w:left="1080" w:hanging="360"/>
+        <w:ind w:left="1440" w:hanging="360"/>
       </w:pPr>
       <w:rPr>
         <w:vertAlign w:val="baseline"/>
@@ -2910,7 +2363,7 @@
       <w:lvlText w:val="%3."/>
       <w:lvlJc w:val="right"/>
       <w:pPr>
-        <w:ind w:left="1800" w:hanging="180"/>
+        <w:ind w:left="2160" w:hanging="180"/>
       </w:pPr>
       <w:rPr>
         <w:vertAlign w:val="baseline"/>
@@ -2922,7 +2375,7 @@
       <w:lvlText w:val="%4."/>
       <w:lvlJc w:val="left"/>
       <w:pPr>
-        <w:ind w:left="2520" w:hanging="360"/>
+        <w:ind w:left="2880" w:hanging="360"/>
       </w:pPr>
       <w:rPr>
         <w:vertAlign w:val="baseline"/>
@@ -2934,7 +2387,7 @@
       <w:lvlText w:val="%5."/>
       <w:lvlJc w:val="left"/>
       <w:pPr>
-        <w:ind w:left="3240" w:hanging="360"/>
+        <w:ind w:left="3600" w:hanging="360"/>
       </w:pPr>
       <w:rPr>
         <w:vertAlign w:val="baseline"/>
@@ -2946,7 +2399,7 @@
       <w:lvlText w:val="%6."/>
       <w:lvlJc w:val="right"/>
       <w:pPr>
-        <w:ind w:left="3960" w:hanging="180"/>
+        <w:ind w:left="4320" w:hanging="180"/>
       </w:pPr>
       <w:rPr>
         <w:vertAlign w:val="baseline"/>
@@ -2958,7 +2411,7 @@
       <w:lvlText w:val="%7."/>
       <w:lvlJc w:val="left"/>
       <w:pPr>
-        <w:ind w:left="4680" w:hanging="360"/>
+        <w:ind w:left="5040" w:hanging="360"/>
       </w:pPr>
       <w:rPr>
         <w:vertAlign w:val="baseline"/>
@@ -2970,7 +2423,7 @@
       <w:lvlText w:val="%8."/>
       <w:lvlJc w:val="left"/>
       <w:pPr>
-        <w:ind w:left="5400" w:hanging="360"/>
+        <w:ind w:left="5760" w:hanging="360"/>
       </w:pPr>
       <w:rPr>
         <w:vertAlign w:val="baseline"/>
@@ -2982,118 +2435,6 @@
       <w:lvlText w:val="%9."/>
       <w:lvlJc w:val="right"/>
       <w:pPr>
-        <w:ind w:left="6120" w:hanging="180"/>
-      </w:pPr>
-      <w:rPr>
-        <w:vertAlign w:val="baseline"/>
-      </w:rPr>
-    </w:lvl>
-  </w:abstractNum>
-  <w:abstractNum w:abstractNumId="2">
-    <w:lvl w:ilvl="0">
-      <w:start w:val="1"/>
-      <w:numFmt w:val="decimal"/>
-      <w:lvlText w:val="%1."/>
-      <w:lvlJc w:val="left"/>
-      <w:pPr>
-        <w:ind w:left="720" w:hanging="360"/>
-      </w:pPr>
-      <w:rPr>
-        <w:b w:val="0"/>
-        <w:bCs w:val="0"/>
-        <w:vertAlign w:val="baseline"/>
-      </w:rPr>
-    </w:lvl>
-    <w:lvl w:ilvl="1">
-      <w:start w:val="1"/>
-      <w:numFmt w:val="lowerLetter"/>
-      <w:lvlText w:val="%2."/>
-      <w:lvlJc w:val="left"/>
-      <w:pPr>
-        <w:ind w:left="1440" w:hanging="360"/>
-      </w:pPr>
-      <w:rPr>
-        <w:vertAlign w:val="baseline"/>
-      </w:rPr>
-    </w:lvl>
-    <w:lvl w:ilvl="2">
-      <w:start w:val="1"/>
-      <w:numFmt w:val="lowerRoman"/>
-      <w:lvlText w:val="%3."/>
-      <w:lvlJc w:val="right"/>
-      <w:pPr>
-        <w:ind w:left="2160" w:hanging="180"/>
-      </w:pPr>
-      <w:rPr>
-        <w:vertAlign w:val="baseline"/>
-      </w:rPr>
-    </w:lvl>
-    <w:lvl w:ilvl="3">
-      <w:start w:val="1"/>
-      <w:numFmt w:val="decimal"/>
-      <w:lvlText w:val="%4."/>
-      <w:lvlJc w:val="left"/>
-      <w:pPr>
-        <w:ind w:left="2880" w:hanging="360"/>
-      </w:pPr>
-      <w:rPr>
-        <w:vertAlign w:val="baseline"/>
-      </w:rPr>
-    </w:lvl>
-    <w:lvl w:ilvl="4">
-      <w:start w:val="1"/>
-      <w:numFmt w:val="lowerLetter"/>
-      <w:lvlText w:val="%5."/>
-      <w:lvlJc w:val="left"/>
-      <w:pPr>
-        <w:ind w:left="3600" w:hanging="360"/>
-      </w:pPr>
-      <w:rPr>
-        <w:vertAlign w:val="baseline"/>
-      </w:rPr>
-    </w:lvl>
-    <w:lvl w:ilvl="5">
-      <w:start w:val="1"/>
-      <w:numFmt w:val="lowerRoman"/>
-      <w:lvlText w:val="%6."/>
-      <w:lvlJc w:val="right"/>
-      <w:pPr>
-        <w:ind w:left="4320" w:hanging="180"/>
-      </w:pPr>
-      <w:rPr>
-        <w:vertAlign w:val="baseline"/>
-      </w:rPr>
-    </w:lvl>
-    <w:lvl w:ilvl="6">
-      <w:start w:val="1"/>
-      <w:numFmt w:val="decimal"/>
-      <w:lvlText w:val="%7."/>
-      <w:lvlJc w:val="left"/>
-      <w:pPr>
-        <w:ind w:left="5040" w:hanging="360"/>
-      </w:pPr>
-      <w:rPr>
-        <w:vertAlign w:val="baseline"/>
-      </w:rPr>
-    </w:lvl>
-    <w:lvl w:ilvl="7">
-      <w:start w:val="1"/>
-      <w:numFmt w:val="lowerLetter"/>
-      <w:lvlText w:val="%8."/>
-      <w:lvlJc w:val="left"/>
-      <w:pPr>
-        <w:ind w:left="5760" w:hanging="360"/>
-      </w:pPr>
-      <w:rPr>
-        <w:vertAlign w:val="baseline"/>
-      </w:rPr>
-    </w:lvl>
-    <w:lvl w:ilvl="8">
-      <w:start w:val="1"/>
-      <w:numFmt w:val="lowerRoman"/>
-      <w:lvlText w:val="%9."/>
-      <w:lvlJc w:val="right"/>
-      <w:pPr>
         <w:ind w:left="6480" w:hanging="180"/>
       </w:pPr>
       <w:rPr>
@@ -3103,9 +2444,6 @@
   </w:abstractNum>
   <w:num w:numId="1">
     <w:abstractNumId w:val="1"/>
-  </w:num>
-  <w:num w:numId="2">
-    <w:abstractNumId w:val="2"/>
   </w:num>
 </w:numbering>
 </file>
@@ -3471,19 +2809,6 @@
       </w:tblCellMar>
     </w:tblPr>
   </w:style>
-  <w:style w:type="table" w:styleId="Table4">
-    <w:basedOn w:val="TableNormal"/>
-    <w:tblPr>
-      <w:tblStyleRowBandSize w:val="1"/>
-      <w:tblStyleColBandSize w:val="1"/>
-      <w:tblCellMar>
-        <w:top w:w="0.0" w:type="dxa"/>
-        <w:left w:w="70.0" w:type="dxa"/>
-        <w:bottom w:w="0.0" w:type="dxa"/>
-        <w:right w:w="70.0" w:type="dxa"/>
-      </w:tblCellMar>
-    </w:tblPr>
-  </w:style>
 </w:styles>
 </file>
 

</xml_diff>